<commit_message>
draft: initialise skeleton and complete Section III.A first draft
FloodShocks_v02_05Apr2026.docx — next page section break inserted;
I–VIII + References headings in place; Section III.A prose complete
(5 paragraphs, PAPER_Body style throughout); footnote 1 anchored
via Word footnote system; two Zotero citation placeholders pending
AEA style installation. All locked numbers from codebook v2.6 used
without modification.
</commit_message>
<xml_diff>
--- a/06_Drafts/FloodShocks_v01_03Apr2026.docx
+++ b/06_Drafts/FloodShocks_v01_03Apr2026.docx
@@ -6,22 +6,816 @@
       <w:pPr>
         <w:pStyle w:val="PAPERReferences"/>
         <w:rPr>
-          <w:lang w:val="en-US"/>
-        </w:rPr>
-      </w:pPr>
-      <w:r>
-        <w:rPr>
-          <w:lang w:val="en-US"/>
-        </w:rPr>
+          <w:sz w:val="28"/>
+          <w:szCs w:val="28"/>
+          <w:lang w:val="en-US"/>
+        </w:rPr>
+      </w:pPr>
+    </w:p>
+    <w:p>
+      <w:pPr>
+        <w:pStyle w:val="PAPERReferences"/>
+        <w:rPr>
+          <w:sz w:val="28"/>
+          <w:szCs w:val="28"/>
+          <w:lang w:val="en-US"/>
+        </w:rPr>
+      </w:pPr>
+    </w:p>
+    <w:p>
+      <w:pPr>
+        <w:pStyle w:val="PAPERReferences"/>
+        <w:rPr>
+          <w:sz w:val="28"/>
+          <w:szCs w:val="28"/>
+          <w:lang w:val="en-US"/>
+        </w:rPr>
+      </w:pPr>
+    </w:p>
+    <w:p>
+      <w:pPr>
+        <w:pStyle w:val="PAPERReferences"/>
+        <w:rPr>
+          <w:sz w:val="28"/>
+          <w:szCs w:val="28"/>
+          <w:lang w:val="en-US"/>
+        </w:rPr>
+      </w:pPr>
+    </w:p>
+    <w:p>
+      <w:pPr>
+        <w:pStyle w:val="PAPERReferences"/>
+        <w:spacing w:after="0"/>
+        <w:jc w:val="center"/>
+        <w:rPr>
+          <w:b/>
+          <w:bCs/>
+          <w:sz w:val="40"/>
+          <w:szCs w:val="40"/>
+          <w:lang w:val="en-US"/>
+        </w:rPr>
+      </w:pPr>
+      <w:r>
+        <w:rPr>
+          <w:b/>
+          <w:bCs/>
+          <w:sz w:val="40"/>
+          <w:szCs w:val="40"/>
+          <w:lang w:val="en-US"/>
+        </w:rPr>
+        <w:t>Flood Shocks and the Two-Phase Deposit Cycle</w:t>
+      </w:r>
+    </w:p>
+    <w:p>
+      <w:pPr>
+        <w:pStyle w:val="PAPERReferences"/>
+        <w:jc w:val="center"/>
+        <w:rPr>
+          <w:i/>
+          <w:iCs/>
+          <w:sz w:val="32"/>
+          <w:szCs w:val="32"/>
+          <w:lang w:val="en-US"/>
+        </w:rPr>
+      </w:pPr>
+      <w:r>
+        <w:rPr>
+          <w:i/>
+          <w:iCs/>
+          <w:sz w:val="32"/>
+          <w:szCs w:val="32"/>
+          <w:lang w:val="en-US"/>
+        </w:rPr>
+        <w:t>A Nighttime Lights Identification</w:t>
+      </w:r>
+    </w:p>
+    <w:p>
+      <w:pPr>
+        <w:pStyle w:val="PAPERReferences"/>
+        <w:rPr>
+          <w:i/>
+          <w:iCs/>
+          <w:sz w:val="32"/>
+          <w:szCs w:val="32"/>
+          <w:lang w:val="en-US"/>
+        </w:rPr>
+      </w:pPr>
+    </w:p>
+    <w:p>
+      <w:pPr>
+        <w:pStyle w:val="PAPERReferences"/>
+        <w:pBdr>
+          <w:top w:val="single" w:sz="8" w:space="1" w:color="auto"/>
+        </w:pBdr>
+        <w:jc w:val="center"/>
+        <w:rPr>
+          <w:i/>
+          <w:iCs/>
+          <w:sz w:val="32"/>
+          <w:szCs w:val="32"/>
+          <w:lang w:val="en-US"/>
+        </w:rPr>
+      </w:pPr>
+    </w:p>
+    <w:p>
+      <w:pPr>
+        <w:pStyle w:val="PAPERReferences"/>
+        <w:pBdr>
+          <w:top w:val="single" w:sz="8" w:space="1" w:color="auto"/>
+        </w:pBdr>
+        <w:jc w:val="center"/>
+        <w:rPr>
+          <w:sz w:val="32"/>
+          <w:szCs w:val="32"/>
+          <w:lang w:val="en-US"/>
+        </w:rPr>
+      </w:pPr>
+    </w:p>
+    <w:p>
+      <w:pPr>
+        <w:pStyle w:val="PAPERReferences"/>
+        <w:pBdr>
+          <w:top w:val="single" w:sz="8" w:space="1" w:color="auto"/>
+        </w:pBdr>
+        <w:jc w:val="center"/>
+        <w:rPr>
+          <w:b/>
+          <w:bCs/>
+          <w:sz w:val="32"/>
+          <w:szCs w:val="32"/>
+          <w:lang w:val="en-US"/>
+        </w:rPr>
+      </w:pPr>
+      <w:r>
+        <w:rPr>
+          <w:b/>
+          <w:bCs/>
+          <w:sz w:val="32"/>
+          <w:szCs w:val="32"/>
+          <w:lang w:val="en-US"/>
+        </w:rPr>
+        <w:t>Jaseel Badar</w:t>
+      </w:r>
+    </w:p>
+    <w:p>
+      <w:pPr>
+        <w:pStyle w:val="PAPERReferences"/>
+        <w:pBdr>
+          <w:top w:val="single" w:sz="8" w:space="1" w:color="auto"/>
+        </w:pBdr>
+        <w:jc w:val="center"/>
+        <w:rPr>
+          <w:i/>
+          <w:iCs/>
+          <w:sz w:val="28"/>
+          <w:szCs w:val="28"/>
+          <w:lang w:val="en-US"/>
+        </w:rPr>
+      </w:pPr>
+      <w:r>
+        <w:rPr>
+          <w:i/>
+          <w:iCs/>
+          <w:sz w:val="28"/>
+          <w:szCs w:val="28"/>
+          <w:lang w:val="en-US"/>
+        </w:rPr>
+        <w:t>Harvard University</w:t>
+      </w:r>
+      <w:r>
+        <w:rPr>
+          <w:i/>
+          <w:iCs/>
+          <w:sz w:val="28"/>
+          <w:szCs w:val="28"/>
+          <w:lang w:val="en-US"/>
+        </w:rPr>
+        <w:t xml:space="preserve"> Extension School</w:t>
+      </w:r>
+    </w:p>
+    <w:p>
+      <w:pPr>
+        <w:pStyle w:val="PAPERReferences"/>
+        <w:pBdr>
+          <w:top w:val="single" w:sz="8" w:space="1" w:color="auto"/>
+        </w:pBdr>
+        <w:jc w:val="center"/>
+        <w:rPr>
+          <w:sz w:val="28"/>
+          <w:szCs w:val="28"/>
+          <w:lang w:val="en-US"/>
+        </w:rPr>
+      </w:pPr>
+      <w:r>
+        <w:rPr>
+          <w:sz w:val="28"/>
+          <w:szCs w:val="28"/>
+          <w:lang w:val="en-US"/>
+        </w:rPr>
+        <w:t>April 2026</w:t>
+      </w:r>
+    </w:p>
+    <w:p>
+      <w:pPr>
+        <w:pStyle w:val="PAPERReferences"/>
+        <w:jc w:val="center"/>
+        <w:rPr>
+          <w:color w:val="C00000"/>
+          <w:sz w:val="28"/>
+          <w:szCs w:val="28"/>
+          <w:lang w:val="en-US"/>
+        </w:rPr>
+      </w:pPr>
+      <w:r>
+        <w:rPr>
+          <w:color w:val="C00000"/>
+          <w:sz w:val="28"/>
+          <w:szCs w:val="28"/>
+          <w:lang w:val="en-US"/>
+        </w:rPr>
+        <w:t>Working Paper</w:t>
+      </w:r>
+    </w:p>
+    <w:p>
+      <w:pPr>
+        <w:pStyle w:val="PAPERReferences"/>
+        <w:jc w:val="center"/>
+        <w:rPr>
+          <w:color w:val="C00000"/>
+          <w:sz w:val="28"/>
+          <w:szCs w:val="28"/>
+          <w:lang w:val="en-US"/>
+        </w:rPr>
+      </w:pPr>
+    </w:p>
+    <w:p>
+      <w:pPr>
+        <w:pStyle w:val="PAPERReferences"/>
+        <w:pBdr>
+          <w:top w:val="single" w:sz="8" w:space="1" w:color="auto"/>
+        </w:pBdr>
+        <w:jc w:val="center"/>
+        <w:rPr>
+          <w:i/>
+          <w:iCs/>
+          <w:sz w:val="32"/>
+          <w:szCs w:val="32"/>
+          <w:lang w:val="en-US"/>
+        </w:rPr>
+      </w:pPr>
+    </w:p>
+    <w:p>
+      <w:pPr>
+        <w:pStyle w:val="PAPERReferences"/>
+        <w:pBdr>
+          <w:top w:val="single" w:sz="8" w:space="1" w:color="auto"/>
+        </w:pBdr>
+        <w:jc w:val="center"/>
+        <w:rPr>
+          <w:sz w:val="32"/>
+          <w:szCs w:val="32"/>
+          <w:lang w:val="en-US"/>
+        </w:rPr>
+      </w:pPr>
+    </w:p>
+    <w:p>
+      <w:pPr>
+        <w:pStyle w:val="PAPERReferences"/>
+        <w:pBdr>
+          <w:top w:val="single" w:sz="8" w:space="1" w:color="auto"/>
+        </w:pBdr>
+        <w:spacing w:after="120"/>
+        <w:jc w:val="center"/>
+        <w:rPr>
+          <w:b/>
+          <w:bCs/>
+          <w:sz w:val="28"/>
+          <w:szCs w:val="28"/>
+          <w:lang w:val="en-US"/>
+        </w:rPr>
+      </w:pPr>
+      <w:r>
+        <w:rPr>
+          <w:b/>
+          <w:bCs/>
+          <w:sz w:val="28"/>
+          <w:szCs w:val="28"/>
+          <w:lang w:val="en-US"/>
+        </w:rPr>
+        <w:t>Abstract</w:t>
+      </w:r>
+    </w:p>
+    <w:p>
+      <w:pPr>
+        <w:pStyle w:val="PAPERReferences"/>
+        <w:pBdr>
+          <w:top w:val="single" w:sz="8" w:space="1" w:color="auto"/>
+        </w:pBdr>
+        <w:ind w:firstLine="720"/>
+        <w:rPr>
+          <w:sz w:val="28"/>
+          <w:szCs w:val="28"/>
+        </w:rPr>
+      </w:pPr>
+      <w:r>
+        <w:rPr>
+          <w:sz w:val="28"/>
+          <w:szCs w:val="28"/>
+        </w:rPr>
+        <w:t>[Abstract to be completed after all sections are drafted.]</w:t>
+      </w:r>
+    </w:p>
+    <w:p>
+      <w:pPr>
+        <w:pStyle w:val="PAPERReferences"/>
+        <w:pBdr>
+          <w:top w:val="single" w:sz="8" w:space="1" w:color="auto"/>
+        </w:pBdr>
+        <w:rPr>
+          <w:sz w:val="28"/>
+          <w:szCs w:val="28"/>
+        </w:rPr>
+      </w:pPr>
+    </w:p>
+    <w:p>
+      <w:pPr>
+        <w:pStyle w:val="PAPERReferences"/>
+        <w:pBdr>
+          <w:top w:val="single" w:sz="8" w:space="1" w:color="auto"/>
+        </w:pBdr>
+        <w:rPr>
+          <w:sz w:val="28"/>
+          <w:szCs w:val="28"/>
+        </w:rPr>
+      </w:pPr>
+    </w:p>
+    <w:p>
+      <w:pPr>
+        <w:pStyle w:val="PAPERReferences"/>
+        <w:pBdr>
+          <w:top w:val="single" w:sz="8" w:space="1" w:color="auto"/>
+        </w:pBdr>
+        <w:jc w:val="left"/>
+        <w:rPr>
+          <w:sz w:val="24"/>
+          <w:szCs w:val="24"/>
+          <w:lang w:val="en-US"/>
+        </w:rPr>
+      </w:pPr>
+      <w:r>
+        <w:rPr>
+          <w:b/>
+          <w:bCs/>
+          <w:sz w:val="24"/>
+          <w:szCs w:val="24"/>
+          <w:lang w:val="en-US"/>
+        </w:rPr>
+        <w:t>JEL Classification:</w:t>
+      </w:r>
+      <w:r>
+        <w:rPr>
+          <w:sz w:val="24"/>
+          <w:szCs w:val="24"/>
+          <w:lang w:val="en-US"/>
+        </w:rPr>
+        <w:t xml:space="preserve"> G21, Q54, O16, R11</w:t>
+      </w:r>
+      <w:r>
+        <w:rPr>
+          <w:sz w:val="24"/>
+          <w:szCs w:val="24"/>
+          <w:lang w:val="en-US"/>
+        </w:rPr>
+        <w:br/>
+      </w:r>
+      <w:r>
+        <w:rPr>
+          <w:b/>
+          <w:bCs/>
+          <w:sz w:val="24"/>
+          <w:szCs w:val="24"/>
+          <w:lang w:val="en-US"/>
+        </w:rPr>
+        <w:t xml:space="preserve">Keywords: </w:t>
+      </w:r>
+      <w:r>
+        <w:rPr>
+          <w:sz w:val="24"/>
+          <w:szCs w:val="24"/>
+          <w:lang w:val="en-US"/>
+        </w:rPr>
+        <w:t>flood shocks, bank deposits, nighttime lights, instrumental variables, liquidity risk, India, climate finance</w:t>
+      </w:r>
+    </w:p>
+    <w:p>
+      <w:pPr>
+        <w:pStyle w:val="PAPERReferences"/>
+        <w:pBdr>
+          <w:top w:val="single" w:sz="8" w:space="1" w:color="auto"/>
+        </w:pBdr>
+        <w:jc w:val="left"/>
+        <w:rPr>
+          <w:sz w:val="24"/>
+          <w:szCs w:val="24"/>
+          <w:lang w:val="en-US"/>
+        </w:rPr>
+      </w:pPr>
+    </w:p>
+    <w:p>
+      <w:pPr>
+        <w:pStyle w:val="PAPERReferences"/>
+        <w:pBdr>
+          <w:top w:val="single" w:sz="8" w:space="1" w:color="auto"/>
+        </w:pBdr>
+        <w:jc w:val="center"/>
+        <w:rPr>
+          <w:i/>
+          <w:iCs/>
+          <w:lang w:val="en-US"/>
+        </w:rPr>
+      </w:pPr>
+      <w:r>
+        <w:rPr>
+          <w:i/>
+          <w:iCs/>
+          <w:lang w:val="en-US"/>
+        </w:rPr>
+        <w:t>Correspondence: jaseelbadar123@gmail.com</w:t>
+      </w:r>
+      <w:r>
+        <w:rPr>
+          <w:i/>
+          <w:iCs/>
+          <w:lang w:val="en-US"/>
+        </w:rPr>
+        <w:br w:type="page"/>
+      </w:r>
+    </w:p>
+    <w:p>
+      <w:pPr>
+        <w:pStyle w:val="PAPERH1"/>
+        <w:numPr>
+          <w:ilvl w:val="0"/>
+          <w:numId w:val="1"/>
+        </w:numPr>
+        <w:spacing w:line="480" w:lineRule="auto"/>
+      </w:pPr>
+      <w:r>
+        <w:lastRenderedPageBreak/>
+        <w:t>I</w:t>
+      </w:r>
+      <w:r>
+        <w:t>ntroduction</w:t>
+      </w:r>
+    </w:p>
+    <w:p>
+      <w:pPr>
+        <w:pStyle w:val="PAPERBody"/>
+      </w:pPr>
+    </w:p>
+    <w:p>
+      <w:pPr>
+        <w:pStyle w:val="PAPERH1"/>
+        <w:numPr>
+          <w:ilvl w:val="0"/>
+          <w:numId w:val="1"/>
+        </w:numPr>
+        <w:spacing w:line="480" w:lineRule="auto"/>
+      </w:pPr>
+      <w:r>
+        <w:t>R</w:t>
+      </w:r>
+      <w:r>
+        <w:t>elated Literature</w:t>
+      </w:r>
+    </w:p>
+    <w:p>
+      <w:pPr>
+        <w:pStyle w:val="PAPERBody"/>
+      </w:pPr>
+    </w:p>
+    <w:p>
+      <w:pPr>
+        <w:pStyle w:val="PAPERH1"/>
+        <w:numPr>
+          <w:ilvl w:val="0"/>
+          <w:numId w:val="1"/>
+        </w:numPr>
+        <w:spacing w:line="480" w:lineRule="auto"/>
+      </w:pPr>
+      <w:r>
+        <w:t>D</w:t>
+      </w:r>
+      <w:r>
+        <w:t>ata</w:t>
+      </w:r>
+    </w:p>
+    <w:p>
+      <w:pPr>
+        <w:pStyle w:val="PAPERH2"/>
+        <w:spacing w:line="480" w:lineRule="auto"/>
+      </w:pPr>
+      <w:r>
+        <w:t>III.</w:t>
+      </w:r>
+      <w:proofErr w:type="gramStart"/>
+      <w:r>
         <w:t>A</w:t>
       </w:r>
+      <w:proofErr w:type="gramEnd"/>
+      <w:r>
+        <w:t xml:space="preserve"> RBI District-Level Deposits</w:t>
+      </w:r>
+    </w:p>
+    <w:p>
+      <w:pPr>
+        <w:pStyle w:val="PAPERBody"/>
+      </w:pPr>
+      <w:r>
+        <w:t>The deposit data come from the Reserve Bank of India's Basic Statistical Returns (BSR-2), which tabulates aggregate scheduled commercial bank deposits at the district level on a quarterly basis [CITE: RBI BSR-2]. The BSR-2 covers all scheduled commercial banks operating across Indian states and union territories and aggregates deposits across population groups — current, savings, and term accounts — into a single district-level total. I extract data from three workbooks spanning 2004Q1 to 2024Q4 and retain the 2015Q1–2024Q4 window for the analysis sample.</w:t>
+      </w:r>
+    </w:p>
+    <w:p>
+      <w:pPr>
+        <w:pStyle w:val="PAPERBody"/>
+      </w:pPr>
+    </w:p>
+    <w:p>
+      <w:pPr>
+        <w:pStyle w:val="PAPERBody"/>
+      </w:pPr>
+      <w:r>
+        <w:t>Deposits are denominated in nominal Indian Rupees, expressed in Crores. The primary outcome variable is the log-</w:t>
+      </w:r>
+      <w:proofErr w:type="gramStart"/>
+      <w:r>
+        <w:t>first-difference</w:t>
+      </w:r>
+      <w:proofErr w:type="gramEnd"/>
+      <w:r>
+        <w:t xml:space="preserve"> of district deposits: $</w:t>
+      </w:r>
+      <w:proofErr w:type="gramStart"/>
+      <w:r>
+        <w:t>\Delta\text{</w:t>
+      </w:r>
+      <w:proofErr w:type="gramEnd"/>
+      <w:r>
+        <w:t>Deposits}{it} = \ln(\</w:t>
+      </w:r>
+      <w:proofErr w:type="gramStart"/>
+      <w:r>
+        <w:t>text{</w:t>
+      </w:r>
+      <w:proofErr w:type="gramEnd"/>
+      <w:r>
+        <w:t>Deposits}{it} + 1) - \ln(\</w:t>
+      </w:r>
+      <w:proofErr w:type="gramStart"/>
+      <w:r>
+        <w:t>text{</w:t>
+      </w:r>
+      <w:proofErr w:type="gramEnd"/>
+      <w:r>
+        <w:t>Deposits}_{</w:t>
+      </w:r>
+      <w:proofErr w:type="gramStart"/>
+      <w:r>
+        <w:t>i,t</w:t>
+      </w:r>
+      <w:proofErr w:type="gramEnd"/>
+      <w:r>
+        <w:t xml:space="preserve">-1} + </w:t>
+      </w:r>
+      <w:proofErr w:type="gramStart"/>
+      <w:r>
+        <w:t>1)$</w:t>
+      </w:r>
+      <w:proofErr w:type="gramEnd"/>
+      <w:r>
+        <w:t>. The additive offset of one is negligible at the Crore scale, where the minimum observed value exceeds 28 Crores. This transformation converts nominal deposit levels to approximate quarterly growth rates and, by construction, removes district-level fixed trends in the distributed-lag specification. I retain deposits in nominal terms throughout. Quarter fixed effects absorb national price movements in all specifications; the absence of district-quarter price indices at the required granularity precludes deflation below the national level.</w:t>
+      </w:r>
+    </w:p>
+    <w:p>
+      <w:pPr>
+        <w:pStyle w:val="PAPERBody"/>
+      </w:pPr>
+    </w:p>
+    <w:p>
+      <w:pPr>
+        <w:pStyle w:val="PAPERBody"/>
+      </w:pPr>
+      <w:r>
+        <w:t xml:space="preserve">The RBI district classification does not maintain stable boundaries across publication years. I map RBI district names to GADM v4.1 </w:t>
+      </w:r>
+      <w:proofErr w:type="gramStart"/>
+      <w:r>
+        <w:t>Level-2</w:t>
+      </w:r>
+      <w:proofErr w:type="gramEnd"/>
+      <w:r>
+        <w:t xml:space="preserve"> polygon boundaries using a crosswalk constructed in Script 08 [CITE: GADM]. The raw crosswalk contains 762 RBI district entries. After restricting to the 631 composite district-state pairs with full VIIRS nighttime lights coverage, the analysis sample comprises 23,347 district-quarter observations across 631 districts and 37 quarters. Deposit observations are available for 98.9 percent of these district-quarters; 268 district-quarters carry missing values, generating 905 missing observations in the first-differenced deposit growth series.</w:t>
+      </w:r>
+    </w:p>
+    <w:p>
+      <w:pPr>
+        <w:pStyle w:val="PAPERBody"/>
+      </w:pPr>
+    </w:p>
+    <w:p>
+      <w:pPr>
+        <w:pStyle w:val="PAPERBody"/>
+      </w:pPr>
+      <w:r>
+        <w:t>Three quarters — 2016Q3, 2016Q4, and 2017Q1 — are absent from the panel. The Reserve Bank suspended district-level BSR-2 publication during India's demonetization episode of November 2016 and its immediate aftermath. Deposit figures for this window are unreliable and are excluded at the data extraction stage. Full-year deposit figures for 2016 and 2017 are not reported in this paper.</w:t>
+      </w:r>
+    </w:p>
+    <w:p>
+      <w:pPr>
+        <w:pStyle w:val="PAPERBody"/>
+      </w:pPr>
+    </w:p>
+    <w:p>
+      <w:pPr>
+        <w:pStyle w:val="PAPERBody"/>
+      </w:pPr>
+      <w:r>
+        <w:t xml:space="preserve">Across the 22,442 non-missing observations in the deposit growth series, mean quarterly growth is 2.33 percentage points (standard deviation 7.43 percentage points). The distribution is approximately symmetric at the </w:t>
+      </w:r>
+      <w:proofErr w:type="gramStart"/>
+      <w:r>
+        <w:t>median</w:t>
+      </w:r>
+      <w:proofErr w:type="gramEnd"/>
+      <w:r>
+        <w:t xml:space="preserve"> but exhibits pronounced left-tail asymmetry in 2023, concentrated in Northeast districts where low absolute deposit levels amplify percentage volatility.</w:t>
+      </w:r>
+    </w:p>
+    <w:p>
+      <w:pPr>
+        <w:pStyle w:val="PAPERH2"/>
+        <w:spacing w:line="480" w:lineRule="auto"/>
+      </w:pPr>
+      <w:r>
+        <w:t>III.B EM-DAT Flood Events</w:t>
+      </w:r>
+    </w:p>
+    <w:p>
+      <w:pPr>
+        <w:pStyle w:val="PAPERBody"/>
+      </w:pPr>
+    </w:p>
+    <w:p>
+      <w:pPr>
+        <w:pStyle w:val="PAPERH2"/>
+        <w:spacing w:line="480" w:lineRule="auto"/>
+      </w:pPr>
+      <w:r>
+        <w:lastRenderedPageBreak/>
+        <w:t>III.C VIIRS Nighttime Lights</w:t>
+      </w:r>
+    </w:p>
+    <w:p>
+      <w:pPr>
+        <w:pStyle w:val="PAPERBody"/>
+      </w:pPr>
+    </w:p>
+    <w:p>
+      <w:pPr>
+        <w:pStyle w:val="PAPERH2"/>
+        <w:spacing w:line="480" w:lineRule="auto"/>
+      </w:pPr>
+      <w:r>
+        <w:t>III.D Panel Construction</w:t>
+      </w:r>
+    </w:p>
+    <w:p>
+      <w:pPr>
+        <w:pStyle w:val="PAPERBody"/>
+      </w:pPr>
+    </w:p>
+    <w:p>
+      <w:pPr>
+        <w:pStyle w:val="PAPERH1"/>
+        <w:numPr>
+          <w:ilvl w:val="0"/>
+          <w:numId w:val="1"/>
+        </w:numPr>
+        <w:spacing w:line="480" w:lineRule="auto"/>
+      </w:pPr>
+      <w:r>
+        <w:t>I</w:t>
+      </w:r>
+      <w:r>
+        <w:t>dentification</w:t>
+      </w:r>
+      <w:r>
+        <w:t xml:space="preserve"> S</w:t>
+      </w:r>
+      <w:r>
+        <w:t>trategy</w:t>
+      </w:r>
+    </w:p>
+    <w:p>
+      <w:pPr>
+        <w:pStyle w:val="PAPERBody"/>
+      </w:pPr>
+    </w:p>
+    <w:p>
+      <w:pPr>
+        <w:pStyle w:val="PAPERH1"/>
+        <w:numPr>
+          <w:ilvl w:val="0"/>
+          <w:numId w:val="1"/>
+        </w:numPr>
+        <w:spacing w:line="480" w:lineRule="auto"/>
+      </w:pPr>
+      <w:r>
+        <w:t>Results</w:t>
+      </w:r>
+    </w:p>
+    <w:p>
+      <w:pPr>
+        <w:pStyle w:val="PAPERBody"/>
+      </w:pPr>
+    </w:p>
+    <w:p>
+      <w:pPr>
+        <w:pStyle w:val="PAPERH1"/>
+        <w:numPr>
+          <w:ilvl w:val="0"/>
+          <w:numId w:val="1"/>
+        </w:numPr>
+        <w:spacing w:line="480" w:lineRule="auto"/>
+      </w:pPr>
+      <w:r>
+        <w:t>Robustness</w:t>
+      </w:r>
+    </w:p>
+    <w:p>
+      <w:pPr>
+        <w:pStyle w:val="PAPERBody"/>
+      </w:pPr>
+    </w:p>
+    <w:p>
+      <w:pPr>
+        <w:pStyle w:val="PAPERH1"/>
+        <w:numPr>
+          <w:ilvl w:val="0"/>
+          <w:numId w:val="1"/>
+        </w:numPr>
+        <w:spacing w:line="480" w:lineRule="auto"/>
+      </w:pPr>
+      <w:r>
+        <w:t xml:space="preserve">Discussion </w:t>
+      </w:r>
+      <w:r>
+        <w:t>a</w:t>
+      </w:r>
+      <w:r>
+        <w:t>nd Mechanism</w:t>
+      </w:r>
+    </w:p>
+    <w:p>
+      <w:pPr>
+        <w:pStyle w:val="ListParagraph"/>
+        <w:spacing w:line="480" w:lineRule="auto"/>
+      </w:pPr>
+    </w:p>
+    <w:p>
+      <w:pPr>
+        <w:pStyle w:val="PAPERH1"/>
+        <w:numPr>
+          <w:ilvl w:val="0"/>
+          <w:numId w:val="1"/>
+        </w:numPr>
+        <w:spacing w:line="480" w:lineRule="auto"/>
+      </w:pPr>
+      <w:r>
+        <w:t>Conclusion</w:t>
+      </w:r>
+    </w:p>
+    <w:p>
+      <w:pPr>
+        <w:pStyle w:val="PAPERBody"/>
+      </w:pPr>
+    </w:p>
+    <w:p>
+      <w:pPr>
+        <w:pStyle w:val="PAPERH1"/>
+        <w:spacing w:line="480" w:lineRule="auto"/>
+      </w:pPr>
+      <w:r>
+        <w:t>References</w:t>
+      </w:r>
     </w:p>
     <w:sectPr>
-      <w:headerReference w:type="default" r:id="rId6"/>
-      <w:footerReference w:type="default" r:id="rId7"/>
+      <w:headerReference w:type="default" r:id="rId8"/>
+      <w:footerReference w:type="default" r:id="rId9"/>
       <w:pgSz w:w="12240" w:h="15840" w:code="1"/>
       <w:pgMar w:top="1440" w:right="1440" w:bottom="1440" w:left="1440" w:header="708" w:footer="708" w:gutter="0"/>
       <w:cols w:space="708"/>
+      <w:titlePg/>
       <w:docGrid w:linePitch="360"/>
     </w:sectPr>
   </w:body>
@@ -75,25 +869,7 @@
           <w:jc w:val="center"/>
         </w:pPr>
         <w:r>
-          <w:fldChar w:fldCharType="begin"/>
-        </w:r>
-        <w:r>
-          <w:instrText xml:space="preserve"> PAGE   \* MERGEFORMAT </w:instrText>
-        </w:r>
-        <w:r>
-          <w:fldChar w:fldCharType="separate"/>
-        </w:r>
-        <w:r>
-          <w:rPr>
-            <w:noProof/>
-          </w:rPr>
-          <w:t>2</w:t>
-        </w:r>
-        <w:r>
-          <w:rPr>
-            <w:noProof/>
-          </w:rPr>
-          <w:fldChar w:fldCharType="end"/>
+          <w:t>1</w:t>
         </w:r>
       </w:p>
     </w:sdtContent>
@@ -192,6 +968,103 @@
     </w:pPr>
   </w:p>
 </w:hdr>
+</file>
+
+<file path=word/numbering.xml><?xml version="1.0" encoding="utf-8"?>
+<w:numbering xmlns:wpc="http://schemas.microsoft.com/office/word/2010/wordprocessingCanvas" xmlns:cx="http://schemas.microsoft.com/office/drawing/2014/chartex" xmlns:cx1="http://schemas.microsoft.com/office/drawing/2015/9/8/chartex" xmlns:cx2="http://schemas.microsoft.com/office/drawing/2015/10/21/chartex" xmlns:cx3="http://schemas.microsoft.com/office/drawing/2016/5/9/chartex" xmlns:cx4="http://schemas.microsoft.com/office/drawing/2016/5/10/chartex" xmlns:cx5="http://schemas.microsoft.com/office/drawing/2016/5/11/chartex" xmlns:cx6="http://schemas.microsoft.com/office/drawing/2016/5/12/chartex" xmlns:cx7="http://schemas.microsoft.com/office/drawing/2016/5/13/chartex" xmlns:cx8="http://schemas.microsoft.com/office/drawing/2016/5/14/chartex" xmlns:mc="http://schemas.openxmlformats.org/markup-compatibility/2006" xmlns:aink="http://schemas.microsoft.com/office/drawing/2016/ink" xmlns:am3d="http://schemas.microsoft.com/office/drawing/2017/model3d" xmlns:o="urn:schemas-microsoft-com:office:office" xmlns:oel="http://schemas.microsoft.com/office/2019/extlst" xmlns:r="http://schemas.openxmlformats.org/officeDocument/2006/relationships" xmlns:m="http://schemas.openxmlformats.org/officeDocument/2006/math" xmlns:v="urn:schemas-microsoft-com:vml" xmlns:wp14="http://schemas.microsoft.com/office/word/2010/wordprocessingDrawing" xmlns:wp="http://schemas.openxmlformats.org/drawingml/2006/wordprocessingDrawing" xmlns:w10="urn:schemas-microsoft-com:office:word" xmlns:w="http://schemas.openxmlformats.org/wordprocessingml/2006/main" xmlns:w14="http://schemas.microsoft.com/office/word/2010/wordml" xmlns:w15="http://schemas.microsoft.com/office/word/2012/wordml" xmlns:w16cex="http://schemas.microsoft.com/office/word/2018/wordml/cex" xmlns:w16cid="http://schemas.microsoft.com/office/word/2016/wordml/cid" xmlns:w16="http://schemas.microsoft.com/office/word/2018/wordml" xmlns:w16du="http://schemas.microsoft.com/office/word/2023/wordml/word16du" xmlns:w16sdtdh="http://schemas.microsoft.com/office/word/2020/wordml/sdtdatahash" xmlns:w16sdtfl="http://schemas.microsoft.com/office/word/2024/wordml/sdtformatlock" xmlns:w16se="http://schemas.microsoft.com/office/word/2015/wordml/symex" xmlns:wpg="http://schemas.microsoft.com/office/word/2010/wordprocessingGroup" xmlns:wpi="http://schemas.microsoft.com/office/word/2010/wordprocessingInk" xmlns:wne="http://schemas.microsoft.com/office/word/2006/wordml" xmlns:wps="http://schemas.microsoft.com/office/word/2010/wordprocessingShape" mc:Ignorable="w14 w15 w16se w16cid w16 w16cex w16sdtdh w16sdtfl w16du wp14">
+  <w:abstractNum w:abstractNumId="0" w15:restartNumberingAfterBreak="0">
+    <w:nsid w:val="578F4701"/>
+    <w:multiLevelType w:val="hybridMultilevel"/>
+    <w:tmpl w:val="8B861484"/>
+    <w:lvl w:ilvl="0" w:tplc="60645FE6">
+      <w:start w:val="1"/>
+      <w:numFmt w:val="upperRoman"/>
+      <w:lvlText w:val="%1."/>
+      <w:lvlJc w:val="left"/>
+      <w:pPr>
+        <w:ind w:left="1440" w:hanging="720"/>
+      </w:pPr>
+      <w:rPr>
+        <w:rFonts w:hint="default"/>
+      </w:rPr>
+    </w:lvl>
+    <w:lvl w:ilvl="1" w:tplc="40090019" w:tentative="1">
+      <w:start w:val="1"/>
+      <w:numFmt w:val="lowerLetter"/>
+      <w:lvlText w:val="%2."/>
+      <w:lvlJc w:val="left"/>
+      <w:pPr>
+        <w:ind w:left="1800" w:hanging="360"/>
+      </w:pPr>
+    </w:lvl>
+    <w:lvl w:ilvl="2" w:tplc="4009001B" w:tentative="1">
+      <w:start w:val="1"/>
+      <w:numFmt w:val="lowerRoman"/>
+      <w:lvlText w:val="%3."/>
+      <w:lvlJc w:val="right"/>
+      <w:pPr>
+        <w:ind w:left="2520" w:hanging="180"/>
+      </w:pPr>
+    </w:lvl>
+    <w:lvl w:ilvl="3" w:tplc="4009000F" w:tentative="1">
+      <w:start w:val="1"/>
+      <w:numFmt w:val="decimal"/>
+      <w:lvlText w:val="%4."/>
+      <w:lvlJc w:val="left"/>
+      <w:pPr>
+        <w:ind w:left="3240" w:hanging="360"/>
+      </w:pPr>
+    </w:lvl>
+    <w:lvl w:ilvl="4" w:tplc="40090019" w:tentative="1">
+      <w:start w:val="1"/>
+      <w:numFmt w:val="lowerLetter"/>
+      <w:lvlText w:val="%5."/>
+      <w:lvlJc w:val="left"/>
+      <w:pPr>
+        <w:ind w:left="3960" w:hanging="360"/>
+      </w:pPr>
+    </w:lvl>
+    <w:lvl w:ilvl="5" w:tplc="4009001B" w:tentative="1">
+      <w:start w:val="1"/>
+      <w:numFmt w:val="lowerRoman"/>
+      <w:lvlText w:val="%6."/>
+      <w:lvlJc w:val="right"/>
+      <w:pPr>
+        <w:ind w:left="4680" w:hanging="180"/>
+      </w:pPr>
+    </w:lvl>
+    <w:lvl w:ilvl="6" w:tplc="4009000F" w:tentative="1">
+      <w:start w:val="1"/>
+      <w:numFmt w:val="decimal"/>
+      <w:lvlText w:val="%7."/>
+      <w:lvlJc w:val="left"/>
+      <w:pPr>
+        <w:ind w:left="5400" w:hanging="360"/>
+      </w:pPr>
+    </w:lvl>
+    <w:lvl w:ilvl="7" w:tplc="40090019" w:tentative="1">
+      <w:start w:val="1"/>
+      <w:numFmt w:val="lowerLetter"/>
+      <w:lvlText w:val="%8."/>
+      <w:lvlJc w:val="left"/>
+      <w:pPr>
+        <w:ind w:left="6120" w:hanging="360"/>
+      </w:pPr>
+    </w:lvl>
+    <w:lvl w:ilvl="8" w:tplc="4009001B" w:tentative="1">
+      <w:start w:val="1"/>
+      <w:numFmt w:val="lowerRoman"/>
+      <w:lvlText w:val="%9."/>
+      <w:lvlJc w:val="right"/>
+      <w:pPr>
+        <w:ind w:left="6840" w:hanging="180"/>
+      </w:pPr>
+    </w:lvl>
+  </w:abstractNum>
+  <w:num w:numId="1" w16cid:durableId="1319453711">
+    <w:abstractNumId w:val="0"/>
+  </w:num>
+</w:numbering>
 </file>
 
 <file path=word/styles.xml><?xml version="1.0" encoding="utf-8"?>
@@ -797,7 +1670,6 @@
   <w:style w:type="character" w:default="1" w:styleId="DefaultParagraphFont">
     <w:name w:val="Default Paragraph Font"/>
     <w:uiPriority w:val="1"/>
-    <w:semiHidden/>
     <w:unhideWhenUsed/>
   </w:style>
   <w:style w:type="table" w:default="1" w:styleId="TableNormal">
@@ -1270,6 +2142,45 @@
     <w:rsid w:val="00B160E4"/>
     <w:rPr>
       <w:rFonts w:ascii="Times New Roman" w:hAnsi="Times New Roman"/>
+    </w:rPr>
+  </w:style>
+  <w:style w:type="paragraph" w:styleId="FootnoteText">
+    <w:name w:val="footnote text"/>
+    <w:basedOn w:val="Normal"/>
+    <w:link w:val="FootnoteTextChar"/>
+    <w:uiPriority w:val="99"/>
+    <w:semiHidden/>
+    <w:unhideWhenUsed/>
+    <w:rsid w:val="007C708A"/>
+    <w:pPr>
+      <w:spacing w:after="0" w:line="240" w:lineRule="auto"/>
+    </w:pPr>
+    <w:rPr>
+      <w:sz w:val="20"/>
+      <w:szCs w:val="20"/>
+    </w:rPr>
+  </w:style>
+  <w:style w:type="character" w:customStyle="1" w:styleId="FootnoteTextChar">
+    <w:name w:val="Footnote Text Char"/>
+    <w:basedOn w:val="DefaultParagraphFont"/>
+    <w:link w:val="FootnoteText"/>
+    <w:uiPriority w:val="99"/>
+    <w:semiHidden/>
+    <w:rsid w:val="007C708A"/>
+    <w:rPr>
+      <w:sz w:val="20"/>
+      <w:szCs w:val="20"/>
+    </w:rPr>
+  </w:style>
+  <w:style w:type="character" w:styleId="FootnoteReference">
+    <w:name w:val="footnote reference"/>
+    <w:basedOn w:val="DefaultParagraphFont"/>
+    <w:uiPriority w:val="99"/>
+    <w:semiHidden/>
+    <w:unhideWhenUsed/>
+    <w:rsid w:val="007C708A"/>
+    <w:rPr>
+      <w:vertAlign w:val="superscript"/>
     </w:rPr>
   </w:style>
 </w:styles>
@@ -1568,4 +2479,16 @@
     </a:ext>
   </a:extLst>
 </a:theme>
+</file>
+
+<file path=customXml/item1.xml><?xml version="1.0" encoding="utf-8"?>
+<b:Sources xmlns:b="http://schemas.openxmlformats.org/officeDocument/2006/bibliography" xmlns="http://schemas.openxmlformats.org/officeDocument/2006/bibliography" SelectedStyle="\APASixthEditionOfficeOnline.xsl" StyleName="APA" Version="6"/>
+</file>
+
+<file path=customXml/itemProps1.xml><?xml version="1.0" encoding="utf-8"?>
+<ds:datastoreItem xmlns:ds="http://schemas.openxmlformats.org/officeDocument/2006/customXml" ds:itemID="{8C50C2AE-F8AF-401A-94B4-DD1DFB3204CB}">
+  <ds:schemaRefs>
+    <ds:schemaRef ds:uri="http://schemas.openxmlformats.org/officeDocument/2006/bibliography"/>
+  </ds:schemaRefs>
+</ds:datastoreItem>
 </file>
</xml_diff>